<commit_message>
Site denetimi düzeltmeleri: og:image, B1 U9 okuma sorusu, Kendin Öğren metinleri, second conditional anlatımı
- index, kendin-ogren, IELTS, hikayeler: og:image ve twitter:image eklendi
- B1 Ünite 9: metinde karşılığı olmayan '78%' sorusu metne dayalı soruyla değiştirildi (HTML + DOCX)
- kendin-ogren: iç not cümlesi kaldırıldı, 'Ücretsiz Danışmanlık', © 2026, Instagram linki
- grammar/b1/second-conditional: 'were' ve Türkçe mantık açıklamaları netleştirildi

Co-Authored-By: Claude Sonnet 5.5 <noreply@anthropic.com>
Claude-Session: https://claude.ai/code/session_01TP1dxiJCDyrxFoYWbNhRn1
</commit_message>
<xml_diff>
--- a/pdfs/ingilizce-b1/b1-unite-9-reported-speech.docx
+++ b/pdfs/ingilizce-b1/b1-unite-9-reported-speech.docx
@@ -4064,7 +4064,7 @@
           <w:sz w:val="20"/>
           <w:szCs w:val="20"/>
         </w:rPr>
-        <w:t xml:space="preserve">1. What percentage of young people said they found disagreement with authority difficult?</w:t>
+        <w:t xml:space="preserve">1. What do many young people find difficult to do, according to the text?</w:t>
       </w:r>
     </w:p>
     <w:tbl>
@@ -7365,7 +7365,7 @@
           <w:sz w:val="19"/>
           <w:szCs w:val="19"/>
         </w:rPr>
-        <w:t xml:space="preserve">78%.</w:t>
+        <w:t xml:space="preserve">Disagree with teachers, parents or managers.</w:t>
       </w:r>
     </w:p>
     <w:p>

</xml_diff>